<commit_message>
Update Marriage_Biodata_Marathi_English.docx with latest astrological, property, income, and contact details
</commit_message>
<xml_diff>
--- a/Marriage_Biodata_Marathi_English.docx
+++ b/Marriage_Biodata_Marathi_English.docx
@@ -1445,92 +1445,66 @@
         <w:tc>
           <w:tcPr>
             <w:tcBorders>
-              <w:top w:color="d9e0e8" w:space="0" w:sz="4" w:val="single"/>
-              <w:left w:color="b9c4d0" w:space="0" w:sz="4" w:val="single"/>
-              <w:bottom w:color="d9e0e8" w:space="0" w:sz="4" w:val="single"/>
-              <w:right w:color="d9e0e8" w:space="0" w:sz="4" w:val="single"/>
-            </w:tcBorders>
-            <w:shd w:fill="f2f5f9" w:val="clear"/>
-            <w:vAlign w:val="center"/>
-          </w:tcPr>
-          <w:p>
-            <w:pPr>
-              <w:widowControl w:val="0"/>
-              <w:rPr/>
-            </w:pPr>
-            <w:r>
-              <w:rPr>
-                <w:rFonts w:ascii="Noto Sans Devanagari" w:cs="Noto Sans Devanagari" w:eastAsia="Noto Sans Devanagari" w:hAnsi="Noto Sans Devanagari"/>
-                <w:b w:val="1"/>
-                <w:bCs w:val="1"/>
+              <w:top w:val="single" w:sz="4" w:space="0" w:color="b9c4d0"/>
+              <w:left w:val="single" w:sz="4" w:space="0" w:color="b9c4d0"/>
+              <w:bottom w:val="single" w:sz="4" w:space="0" w:color="d9e0e8"/>
+              <w:right w:val="single" w:sz="4" w:space="0" w:color="d9e0e8"/>
+            </w:tcBorders>
+            <w:shd w:val="clear" w:fill="f2f5f9"/>
+            <w:vAlign w:val="center"/>
+          </w:tcPr>
+          <w:p>
+            <w:pPr>
+              <w:spacing w:before="40" w:after="0" w:line="276" w:lineRule="auto"/>
+            </w:pPr>
+            <w:r/>
+            <w:r>
+              <w:rPr>
+                <w:rFonts w:ascii="Noto Sans Devanagari" w:hAnsi="Noto Sans Devanagari"/>
+                <w:b/>
                 <w:color w:val="222222"/>
                 <w:sz w:val="20"/>
-                <w:szCs w:val="20"/>
-                <w:rtl w:val="0"/>
-              </w:rPr>
-              <w:t xml:space="preserve">वार्षिक उत्पन्न</w:t>
-            </w:r>
-            <w:r>
-              <w:rPr>
-                <w:rtl w:val="0"/>
-              </w:rPr>
-            </w:r>
-          </w:p>
-          <w:p>
-            <w:pPr>
-              <w:widowControl w:val="0"/>
-              <w:rPr/>
-            </w:pPr>
-            <w:r>
-              <w:rPr>
-                <w:rFonts w:ascii="Noto Sans Devanagari" w:cs="Noto Sans Devanagari" w:eastAsia="Noto Sans Devanagari" w:hAnsi="Noto Sans Devanagari"/>
-                <w:b w:val="1"/>
-                <w:bCs w:val="1"/>
-                <w:i w:val="1"/>
-                <w:iCs w:val="1"/>
-                <w:color w:val="51667f"/>
+              </w:rPr>
+              <w:t>वार्षिक उत्पन्न</w:t>
+            </w:r>
+          </w:p>
+          <w:p>
+            <w:pPr>
+              <w:spacing w:before="0" w:after="40" w:line="276" w:lineRule="auto"/>
+            </w:pPr>
+            <w:r>
+              <w:rPr>
+                <w:rFonts w:ascii="Noto Sans Devanagari" w:hAnsi="Noto Sans Devanagari"/>
+                <w:b/>
+                <w:color w:val="51667F"/>
                 <w:sz w:val="18"/>
-                <w:szCs w:val="18"/>
-                <w:rtl w:val="0"/>
-              </w:rPr>
-              <w:t xml:space="preserve">Annual Income</w:t>
-            </w:r>
-            <w:r>
-              <w:rPr>
-                <w:rtl w:val="0"/>
-              </w:rPr>
-            </w:r>
-          </w:p>
-        </w:tc>
-        <w:tc>
-          <w:tcPr>
-            <w:tcBorders>
-              <w:top w:color="d9e0e8" w:space="0" w:sz="4" w:val="single"/>
-              <w:left w:color="d9e0e8" w:space="0" w:sz="4" w:val="single"/>
-              <w:bottom w:color="d9e0e8" w:space="0" w:sz="4" w:val="single"/>
-              <w:right w:color="b9c4d0" w:space="0" w:sz="4" w:val="single"/>
-            </w:tcBorders>
-            <w:vAlign w:val="center"/>
-          </w:tcPr>
-          <w:p>
-            <w:pPr>
-              <w:widowControl w:val="0"/>
-              <w:rPr/>
-            </w:pPr>
-            <w:r>
-              <w:rPr>
-                <w:rFonts w:ascii="Noto Sans Devanagari" w:cs="Noto Sans Devanagari" w:eastAsia="Noto Sans Devanagari" w:hAnsi="Noto Sans Devanagari"/>
+              </w:rPr>
+              <w:t>Annual Income</w:t>
+            </w:r>
+          </w:p>
+        </w:tc>
+        <w:tc>
+          <w:tcPr>
+            <w:tcBorders>
+              <w:top w:val="single" w:sz="4" w:space="0" w:color="b9c4d0"/>
+              <w:left w:val="single" w:sz="4" w:space="0" w:color="d9e0e8"/>
+              <w:bottom w:val="single" w:sz="4" w:space="0" w:color="d9e0e8"/>
+              <w:right w:val="single" w:sz="4" w:space="0" w:color="b9c4d0"/>
+            </w:tcBorders>
+            <w:vAlign w:val="center"/>
+          </w:tcPr>
+          <w:p>
+            <w:pPr>
+              <w:spacing w:before="40" w:after="40" w:line="276" w:lineRule="auto"/>
+            </w:pPr>
+            <w:r/>
+            <w:r>
+              <w:rPr>
+                <w:rFonts w:ascii="Noto Sans Devanagari" w:hAnsi="Noto Sans Devanagari"/>
                 <w:color w:val="222222"/>
                 <w:sz w:val="21"/>
-                <w:szCs w:val="21"/>
-                <w:rtl w:val="0"/>
-              </w:rPr>
-              <w:t xml:space="preserve">₹८.५ लाख / ₹8.5 Lakh</w:t>
-            </w:r>
-            <w:r>
-              <w:rPr>
-                <w:rtl w:val="0"/>
-              </w:rPr>
+              </w:rPr>
+              <w:t>₹८ लाख / ₹8 Lakh</w:t>
             </w:r>
           </w:p>
         </w:tc>
@@ -2413,92 +2387,66 @@
         <w:tc>
           <w:tcPr>
             <w:tcBorders>
-              <w:top w:color="b9c4d0" w:space="0" w:sz="4" w:val="single"/>
-              <w:left w:color="b9c4d0" w:space="0" w:sz="4" w:val="single"/>
-              <w:bottom w:color="d9e0e8" w:space="0" w:sz="4" w:val="single"/>
-              <w:right w:color="d9e0e8" w:space="0" w:sz="4" w:val="single"/>
-            </w:tcBorders>
-            <w:shd w:fill="f2f5f9" w:val="clear"/>
-            <w:vAlign w:val="center"/>
-          </w:tcPr>
-          <w:p>
-            <w:pPr>
-              <w:widowControl w:val="0"/>
-              <w:rPr/>
-            </w:pPr>
-            <w:r>
-              <w:rPr>
-                <w:rFonts w:ascii="Noto Sans Devanagari" w:cs="Noto Sans Devanagari" w:eastAsia="Noto Sans Devanagari" w:hAnsi="Noto Sans Devanagari"/>
-                <w:b w:val="1"/>
-                <w:bCs w:val="1"/>
+              <w:top w:val="single" w:sz="4" w:space="0" w:color="b9c4d0"/>
+              <w:left w:val="single" w:sz="4" w:space="0" w:color="b9c4d0"/>
+              <w:bottom w:val="single" w:sz="4" w:space="0" w:color="d9e0e8"/>
+              <w:right w:val="single" w:sz="4" w:space="0" w:color="d9e0e8"/>
+            </w:tcBorders>
+            <w:shd w:val="clear" w:fill="f2f5f9"/>
+            <w:vAlign w:val="center"/>
+          </w:tcPr>
+          <w:p>
+            <w:pPr>
+              <w:spacing w:before="40" w:after="0" w:line="276" w:lineRule="auto"/>
+            </w:pPr>
+            <w:r/>
+            <w:r>
+              <w:rPr>
+                <w:rFonts w:ascii="Noto Sans Devanagari" w:hAnsi="Noto Sans Devanagari"/>
+                <w:b/>
                 <w:color w:val="222222"/>
                 <w:sz w:val="20"/>
-                <w:szCs w:val="20"/>
-                <w:rtl w:val="0"/>
-              </w:rPr>
-              <w:t xml:space="preserve">राशी</w:t>
-            </w:r>
-            <w:r>
-              <w:rPr>
-                <w:rtl w:val="0"/>
-              </w:rPr>
-            </w:r>
-          </w:p>
-          <w:p>
-            <w:pPr>
-              <w:widowControl w:val="0"/>
-              <w:rPr/>
-            </w:pPr>
-            <w:r>
-              <w:rPr>
-                <w:rFonts w:ascii="Noto Sans Devanagari" w:cs="Noto Sans Devanagari" w:eastAsia="Noto Sans Devanagari" w:hAnsi="Noto Sans Devanagari"/>
-                <w:b w:val="1"/>
-                <w:bCs w:val="1"/>
-                <w:i w:val="1"/>
-                <w:iCs w:val="1"/>
-                <w:color w:val="51667f"/>
+              </w:rPr>
+              <w:t>राशी</w:t>
+            </w:r>
+          </w:p>
+          <w:p>
+            <w:pPr>
+              <w:spacing w:before="0" w:after="40" w:line="276" w:lineRule="auto"/>
+            </w:pPr>
+            <w:r>
+              <w:rPr>
+                <w:rFonts w:ascii="Noto Sans Devanagari" w:hAnsi="Noto Sans Devanagari"/>
+                <w:b/>
+                <w:color w:val="51667F"/>
                 <w:sz w:val="18"/>
-                <w:szCs w:val="18"/>
-                <w:rtl w:val="0"/>
-              </w:rPr>
-              <w:t xml:space="preserve">Rashi (Moon Sign)</w:t>
-            </w:r>
-            <w:r>
-              <w:rPr>
-                <w:rtl w:val="0"/>
-              </w:rPr>
-            </w:r>
-          </w:p>
-        </w:tc>
-        <w:tc>
-          <w:tcPr>
-            <w:tcBorders>
-              <w:top w:color="b9c4d0" w:space="0" w:sz="4" w:val="single"/>
-              <w:left w:color="d9e0e8" w:space="0" w:sz="4" w:val="single"/>
-              <w:bottom w:color="d9e0e8" w:space="0" w:sz="4" w:val="single"/>
-              <w:right w:color="b9c4d0" w:space="0" w:sz="4" w:val="single"/>
-            </w:tcBorders>
-            <w:vAlign w:val="center"/>
-          </w:tcPr>
-          <w:p>
-            <w:pPr>
-              <w:widowControl w:val="0"/>
-              <w:rPr/>
-            </w:pPr>
-            <w:r>
-              <w:rPr>
-                <w:rFonts w:ascii="Noto Sans Devanagari" w:cs="Noto Sans Devanagari" w:eastAsia="Noto Sans Devanagari" w:hAnsi="Noto Sans Devanagari"/>
+              </w:rPr>
+              <w:t>Rashi (Moon Sign)</w:t>
+            </w:r>
+          </w:p>
+        </w:tc>
+        <w:tc>
+          <w:tcPr>
+            <w:tcBorders>
+              <w:top w:val="single" w:sz="4" w:space="0" w:color="b9c4d0"/>
+              <w:left w:val="single" w:sz="4" w:space="0" w:color="d9e0e8"/>
+              <w:bottom w:val="single" w:sz="4" w:space="0" w:color="d9e0e8"/>
+              <w:right w:val="single" w:sz="4" w:space="0" w:color="b9c4d0"/>
+            </w:tcBorders>
+            <w:vAlign w:val="center"/>
+          </w:tcPr>
+          <w:p>
+            <w:pPr>
+              <w:spacing w:before="40" w:after="40" w:line="276" w:lineRule="auto"/>
+            </w:pPr>
+            <w:r/>
+            <w:r>
+              <w:rPr>
+                <w:rFonts w:ascii="Noto Sans Devanagari" w:hAnsi="Noto Sans Devanagari"/>
                 <w:color w:val="222222"/>
                 <w:sz w:val="21"/>
-                <w:szCs w:val="21"/>
-                <w:rtl w:val="0"/>
-              </w:rPr>
-              <w:t xml:space="preserve">कुंभ / Aquarius</w:t>
-            </w:r>
-            <w:r>
-              <w:rPr>
-                <w:rtl w:val="0"/>
-              </w:rPr>
+              </w:rPr>
+              <w:t>कुंभ / Kumbha (Aquarius)</w:t>
             </w:r>
           </w:p>
         </w:tc>
@@ -2511,92 +2459,66 @@
         <w:tc>
           <w:tcPr>
             <w:tcBorders>
-              <w:top w:color="d9e0e8" w:space="0" w:sz="4" w:val="single"/>
-              <w:left w:color="b9c4d0" w:space="0" w:sz="4" w:val="single"/>
-              <w:bottom w:color="d9e0e8" w:space="0" w:sz="4" w:val="single"/>
-              <w:right w:color="d9e0e8" w:space="0" w:sz="4" w:val="single"/>
-            </w:tcBorders>
-            <w:shd w:fill="f2f5f9" w:val="clear"/>
-            <w:vAlign w:val="center"/>
-          </w:tcPr>
-          <w:p>
-            <w:pPr>
-              <w:widowControl w:val="0"/>
-              <w:rPr/>
-            </w:pPr>
-            <w:r>
-              <w:rPr>
-                <w:rFonts w:ascii="Noto Sans Devanagari" w:cs="Noto Sans Devanagari" w:eastAsia="Noto Sans Devanagari" w:hAnsi="Noto Sans Devanagari"/>
-                <w:b w:val="1"/>
-                <w:bCs w:val="1"/>
+              <w:top w:val="single" w:sz="4" w:space="0" w:color="b9c4d0"/>
+              <w:left w:val="single" w:sz="4" w:space="0" w:color="b9c4d0"/>
+              <w:bottom w:val="single" w:sz="4" w:space="0" w:color="d9e0e8"/>
+              <w:right w:val="single" w:sz="4" w:space="0" w:color="d9e0e8"/>
+            </w:tcBorders>
+            <w:shd w:val="clear" w:fill="f2f5f9"/>
+            <w:vAlign w:val="center"/>
+          </w:tcPr>
+          <w:p>
+            <w:pPr>
+              <w:spacing w:before="40" w:after="0" w:line="276" w:lineRule="auto"/>
+            </w:pPr>
+            <w:r/>
+            <w:r>
+              <w:rPr>
+                <w:rFonts w:ascii="Noto Sans Devanagari" w:hAnsi="Noto Sans Devanagari"/>
+                <w:b/>
                 <w:color w:val="222222"/>
                 <w:sz w:val="20"/>
-                <w:szCs w:val="20"/>
-                <w:rtl w:val="0"/>
-              </w:rPr>
-              <w:t xml:space="preserve">नक्षत्र</w:t>
-            </w:r>
-            <w:r>
-              <w:rPr>
-                <w:rtl w:val="0"/>
-              </w:rPr>
-            </w:r>
-          </w:p>
-          <w:p>
-            <w:pPr>
-              <w:widowControl w:val="0"/>
-              <w:rPr/>
-            </w:pPr>
-            <w:r>
-              <w:rPr>
-                <w:rFonts w:ascii="Noto Sans Devanagari" w:cs="Noto Sans Devanagari" w:eastAsia="Noto Sans Devanagari" w:hAnsi="Noto Sans Devanagari"/>
-                <w:b w:val="1"/>
-                <w:bCs w:val="1"/>
-                <w:i w:val="1"/>
-                <w:iCs w:val="1"/>
-                <w:color w:val="51667f"/>
+              </w:rPr>
+              <w:t>नाड</w:t>
+            </w:r>
+          </w:p>
+          <w:p>
+            <w:pPr>
+              <w:spacing w:before="0" w:after="40" w:line="276" w:lineRule="auto"/>
+            </w:pPr>
+            <w:r>
+              <w:rPr>
+                <w:rFonts w:ascii="Noto Sans Devanagari" w:hAnsi="Noto Sans Devanagari"/>
+                <w:b/>
+                <w:color w:val="51667F"/>
                 <w:sz w:val="18"/>
-                <w:szCs w:val="18"/>
-                <w:rtl w:val="0"/>
-              </w:rPr>
-              <w:t xml:space="preserve">Nakshatra</w:t>
-            </w:r>
-            <w:r>
-              <w:rPr>
-                <w:rtl w:val="0"/>
-              </w:rPr>
-            </w:r>
-          </w:p>
-        </w:tc>
-        <w:tc>
-          <w:tcPr>
-            <w:tcBorders>
-              <w:top w:color="d9e0e8" w:space="0" w:sz="4" w:val="single"/>
-              <w:left w:color="d9e0e8" w:space="0" w:sz="4" w:val="single"/>
-              <w:bottom w:color="d9e0e8" w:space="0" w:sz="4" w:val="single"/>
-              <w:right w:color="b9c4d0" w:space="0" w:sz="4" w:val="single"/>
-            </w:tcBorders>
-            <w:vAlign w:val="center"/>
-          </w:tcPr>
-          <w:p>
-            <w:pPr>
-              <w:widowControl w:val="0"/>
-              <w:rPr/>
-            </w:pPr>
-            <w:r>
-              <w:rPr>
-                <w:rFonts w:ascii="Noto Sans Devanagari" w:cs="Noto Sans Devanagari" w:eastAsia="Noto Sans Devanagari" w:hAnsi="Noto Sans Devanagari"/>
+              </w:rPr>
+              <w:t>Nad</w:t>
+            </w:r>
+          </w:p>
+        </w:tc>
+        <w:tc>
+          <w:tcPr>
+            <w:tcBorders>
+              <w:top w:val="single" w:sz="4" w:space="0" w:color="b9c4d0"/>
+              <w:left w:val="single" w:sz="4" w:space="0" w:color="d9e0e8"/>
+              <w:bottom w:val="single" w:sz="4" w:space="0" w:color="d9e0e8"/>
+              <w:right w:val="single" w:sz="4" w:space="0" w:color="b9c4d0"/>
+            </w:tcBorders>
+            <w:vAlign w:val="center"/>
+          </w:tcPr>
+          <w:p>
+            <w:pPr>
+              <w:spacing w:before="40" w:after="40" w:line="276" w:lineRule="auto"/>
+            </w:pPr>
+            <w:r/>
+            <w:r>
+              <w:rPr>
+                <w:rFonts w:ascii="Noto Sans Devanagari" w:hAnsi="Noto Sans Devanagari"/>
                 <w:color w:val="222222"/>
                 <w:sz w:val="21"/>
-                <w:szCs w:val="21"/>
-                <w:rtl w:val="0"/>
-              </w:rPr>
-              <w:t xml:space="preserve">पूर्व भाद्रपदा / Purva Bhadrapada</w:t>
-            </w:r>
-            <w:r>
-              <w:rPr>
-                <w:rtl w:val="0"/>
-              </w:rPr>
+              </w:rPr>
+              <w:t>आद्य / Adya</w:t>
             </w:r>
           </w:p>
         </w:tc>
@@ -2609,89 +2531,66 @@
         <w:tc>
           <w:tcPr>
             <w:tcBorders>
-              <w:top w:color="d9e0e8" w:space="0" w:sz="4" w:val="single"/>
-              <w:left w:color="b9c4d0" w:space="0" w:sz="4" w:val="single"/>
-              <w:bottom w:color="d9e0e8" w:space="0" w:sz="4" w:val="single"/>
-              <w:right w:color="d9e0e8" w:space="0" w:sz="4" w:val="single"/>
-            </w:tcBorders>
-            <w:shd w:fill="f2f5f9" w:val="clear"/>
-            <w:vAlign w:val="center"/>
-          </w:tcPr>
-          <w:p>
-            <w:pPr>
-              <w:widowControl w:val="0"/>
-              <w:rPr/>
-            </w:pPr>
-            <w:r>
-              <w:rPr>
-                <w:rFonts w:ascii="Noto Sans Devanagari" w:cs="Noto Sans Devanagari" w:eastAsia="Noto Sans Devanagari" w:hAnsi="Noto Sans Devanagari"/>
-                <w:b w:val="1"/>
-                <w:bCs w:val="1"/>
+              <w:top w:val="single" w:sz="4" w:space="0" w:color="b9c4d0"/>
+              <w:left w:val="single" w:sz="4" w:space="0" w:color="b9c4d0"/>
+              <w:bottom w:val="single" w:sz="4" w:space="0" w:color="d9e0e8"/>
+              <w:right w:val="single" w:sz="4" w:space="0" w:color="d9e0e8"/>
+            </w:tcBorders>
+            <w:shd w:val="clear" w:fill="f2f5f9"/>
+            <w:vAlign w:val="center"/>
+          </w:tcPr>
+          <w:p>
+            <w:pPr>
+              <w:spacing w:before="40" w:after="0" w:line="276" w:lineRule="auto"/>
+            </w:pPr>
+            <w:r/>
+            <w:r>
+              <w:rPr>
+                <w:rFonts w:ascii="Noto Sans Devanagari" w:hAnsi="Noto Sans Devanagari"/>
+                <w:b/>
                 <w:color w:val="222222"/>
                 <w:sz w:val="20"/>
-                <w:szCs w:val="20"/>
-                <w:rtl w:val="0"/>
-              </w:rPr>
-              <w:t xml:space="preserve">गोत्र</w:t>
-            </w:r>
-            <w:r>
-              <w:rPr>
-                <w:rtl w:val="0"/>
-              </w:rPr>
-            </w:r>
-          </w:p>
-          <w:p>
-            <w:pPr>
-              <w:widowControl w:val="0"/>
-              <w:rPr/>
-            </w:pPr>
-            <w:r>
-              <w:rPr>
-                <w:rFonts w:ascii="Noto Sans Devanagari" w:cs="Noto Sans Devanagari" w:eastAsia="Noto Sans Devanagari" w:hAnsi="Noto Sans Devanagari"/>
-                <w:b w:val="1"/>
-                <w:bCs w:val="1"/>
-                <w:i w:val="1"/>
-                <w:iCs w:val="1"/>
-                <w:color w:val="51667f"/>
+              </w:rPr>
+              <w:t>नक्षत्र</w:t>
+            </w:r>
+          </w:p>
+          <w:p>
+            <w:pPr>
+              <w:spacing w:before="0" w:after="40" w:line="276" w:lineRule="auto"/>
+            </w:pPr>
+            <w:r>
+              <w:rPr>
+                <w:rFonts w:ascii="Noto Sans Devanagari" w:hAnsi="Noto Sans Devanagari"/>
+                <w:b/>
+                <w:color w:val="51667F"/>
                 <w:sz w:val="18"/>
-                <w:szCs w:val="18"/>
-                <w:rtl w:val="0"/>
-              </w:rPr>
-              <w:t xml:space="preserve">Gotra</w:t>
-            </w:r>
-            <w:r>
-              <w:rPr>
-                <w:rtl w:val="0"/>
-              </w:rPr>
-            </w:r>
-          </w:p>
-        </w:tc>
-        <w:tc>
-          <w:tcPr>
-            <w:tcBorders>
-              <w:top w:color="d9e0e8" w:space="0" w:sz="4" w:val="single"/>
-              <w:left w:color="d9e0e8" w:space="0" w:sz="4" w:val="single"/>
-              <w:bottom w:color="d9e0e8" w:space="0" w:sz="4" w:val="single"/>
-              <w:right w:color="b9c4d0" w:space="0" w:sz="4" w:val="single"/>
-            </w:tcBorders>
-            <w:vAlign w:val="center"/>
-          </w:tcPr>
-          <w:p>
-            <w:pPr>
-              <w:widowControl w:val="0"/>
-              <w:rPr/>
-            </w:pPr>
-            <w:r>
-              <w:rPr>
-                <w:rFonts w:ascii="Baloo" w:cs="Baloo" w:eastAsia="Baloo" w:hAnsi="Baloo"/>
-                <w:rtl w:val="0"/>
-              </w:rPr>
-              <w:t xml:space="preserve">चंद्रत्र / chandratra</w:t>
-            </w:r>
-            <w:r>
-              <w:rPr>
-                <w:rtl w:val="0"/>
-              </w:rPr>
+              </w:rPr>
+              <w:t>Nakshatra</w:t>
+            </w:r>
+          </w:p>
+        </w:tc>
+        <w:tc>
+          <w:tcPr>
+            <w:tcBorders>
+              <w:top w:val="single" w:sz="4" w:space="0" w:color="b9c4d0"/>
+              <w:left w:val="single" w:sz="4" w:space="0" w:color="d9e0e8"/>
+              <w:bottom w:val="single" w:sz="4" w:space="0" w:color="d9e0e8"/>
+              <w:right w:val="single" w:sz="4" w:space="0" w:color="b9c4d0"/>
+            </w:tcBorders>
+            <w:vAlign w:val="center"/>
+          </w:tcPr>
+          <w:p>
+            <w:pPr>
+              <w:spacing w:before="40" w:after="40" w:line="276" w:lineRule="auto"/>
+            </w:pPr>
+            <w:r/>
+            <w:r>
+              <w:rPr>
+                <w:rFonts w:ascii="Noto Sans Devanagari" w:hAnsi="Noto Sans Devanagari"/>
+                <w:color w:val="222222"/>
+                <w:sz w:val="21"/>
+              </w:rPr>
+              <w:t>पूर्व भाद्रपदा (चरण १) / Purva Bhadrapada (Charan 1)</w:t>
             </w:r>
           </w:p>
         </w:tc>
@@ -2704,92 +2603,66 @@
         <w:tc>
           <w:tcPr>
             <w:tcBorders>
-              <w:top w:color="d9e0e8" w:space="0" w:sz="4" w:val="single"/>
-              <w:left w:color="b9c4d0" w:space="0" w:sz="4" w:val="single"/>
-              <w:bottom w:color="d9e0e8" w:space="0" w:sz="4" w:val="single"/>
-              <w:right w:color="d9e0e8" w:space="0" w:sz="4" w:val="single"/>
-            </w:tcBorders>
-            <w:shd w:fill="f2f5f9" w:val="clear"/>
-            <w:vAlign w:val="center"/>
-          </w:tcPr>
-          <w:p>
-            <w:pPr>
-              <w:widowControl w:val="0"/>
-              <w:rPr/>
-            </w:pPr>
-            <w:r>
-              <w:rPr>
-                <w:rFonts w:ascii="Noto Sans Devanagari" w:cs="Noto Sans Devanagari" w:eastAsia="Noto Sans Devanagari" w:hAnsi="Noto Sans Devanagari"/>
-                <w:b w:val="1"/>
-                <w:bCs w:val="1"/>
+              <w:top w:val="single" w:sz="4" w:space="0" w:color="b9c4d0"/>
+              <w:left w:val="single" w:sz="4" w:space="0" w:color="b9c4d0"/>
+              <w:bottom w:val="single" w:sz="4" w:space="0" w:color="d9e0e8"/>
+              <w:right w:val="single" w:sz="4" w:space="0" w:color="d9e0e8"/>
+            </w:tcBorders>
+            <w:shd w:val="clear" w:fill="f2f5f9"/>
+            <w:vAlign w:val="center"/>
+          </w:tcPr>
+          <w:p>
+            <w:pPr>
+              <w:spacing w:before="40" w:after="0" w:line="276" w:lineRule="auto"/>
+            </w:pPr>
+            <w:r/>
+            <w:r>
+              <w:rPr>
+                <w:rFonts w:ascii="Noto Sans Devanagari" w:hAnsi="Noto Sans Devanagari"/>
+                <w:b/>
                 <w:color w:val="222222"/>
                 <w:sz w:val="20"/>
-                <w:szCs w:val="20"/>
-                <w:rtl w:val="0"/>
-              </w:rPr>
-              <w:t xml:space="preserve">कुलदेवता</w:t>
-            </w:r>
-            <w:r>
-              <w:rPr>
-                <w:rtl w:val="0"/>
-              </w:rPr>
-            </w:r>
-          </w:p>
-          <w:p>
-            <w:pPr>
-              <w:widowControl w:val="0"/>
-              <w:rPr/>
-            </w:pPr>
-            <w:r>
-              <w:rPr>
-                <w:rFonts w:ascii="Noto Sans Devanagari" w:cs="Noto Sans Devanagari" w:eastAsia="Noto Sans Devanagari" w:hAnsi="Noto Sans Devanagari"/>
-                <w:b w:val="1"/>
-                <w:bCs w:val="1"/>
-                <w:i w:val="1"/>
-                <w:iCs w:val="1"/>
-                <w:color w:val="51667f"/>
+              </w:rPr>
+              <w:t>गण</w:t>
+            </w:r>
+          </w:p>
+          <w:p>
+            <w:pPr>
+              <w:spacing w:before="0" w:after="40" w:line="276" w:lineRule="auto"/>
+            </w:pPr>
+            <w:r>
+              <w:rPr>
+                <w:rFonts w:ascii="Noto Sans Devanagari" w:hAnsi="Noto Sans Devanagari"/>
+                <w:b/>
+                <w:color w:val="51667F"/>
                 <w:sz w:val="18"/>
-                <w:szCs w:val="18"/>
-                <w:rtl w:val="0"/>
-              </w:rPr>
-              <w:t xml:space="preserve">Kuladevata</w:t>
-            </w:r>
-            <w:r>
-              <w:rPr>
-                <w:rtl w:val="0"/>
-              </w:rPr>
-            </w:r>
-          </w:p>
-        </w:tc>
-        <w:tc>
-          <w:tcPr>
-            <w:tcBorders>
-              <w:top w:color="d9e0e8" w:space="0" w:sz="4" w:val="single"/>
-              <w:left w:color="d9e0e8" w:space="0" w:sz="4" w:val="single"/>
-              <w:bottom w:color="d9e0e8" w:space="0" w:sz="4" w:val="single"/>
-              <w:right w:color="b9c4d0" w:space="0" w:sz="4" w:val="single"/>
-            </w:tcBorders>
-            <w:vAlign w:val="center"/>
-          </w:tcPr>
-          <w:p>
-            <w:pPr>
-              <w:widowControl w:val="0"/>
-              <w:rPr/>
-            </w:pPr>
-            <w:r>
-              <w:rPr>
-                <w:rFonts w:ascii="Noto Sans Devanagari" w:cs="Noto Sans Devanagari" w:eastAsia="Noto Sans Devanagari" w:hAnsi="Noto Sans Devanagari"/>
+              </w:rPr>
+              <w:t>Gana</w:t>
+            </w:r>
+          </w:p>
+        </w:tc>
+        <w:tc>
+          <w:tcPr>
+            <w:tcBorders>
+              <w:top w:val="single" w:sz="4" w:space="0" w:color="b9c4d0"/>
+              <w:left w:val="single" w:sz="4" w:space="0" w:color="d9e0e8"/>
+              <w:bottom w:val="single" w:sz="4" w:space="0" w:color="d9e0e8"/>
+              <w:right w:val="single" w:sz="4" w:space="0" w:color="b9c4d0"/>
+            </w:tcBorders>
+            <w:vAlign w:val="center"/>
+          </w:tcPr>
+          <w:p>
+            <w:pPr>
+              <w:spacing w:before="40" w:after="40" w:line="276" w:lineRule="auto"/>
+            </w:pPr>
+            <w:r/>
+            <w:r>
+              <w:rPr>
+                <w:rFonts w:ascii="Noto Sans Devanagari" w:hAnsi="Noto Sans Devanagari"/>
                 <w:color w:val="222222"/>
                 <w:sz w:val="21"/>
-                <w:szCs w:val="21"/>
-                <w:rtl w:val="0"/>
-              </w:rPr>
-              <w:t xml:space="preserve">पिंगलाई देवी, नेरपिंगलाई आणि व्यंकटेश बालाजी / Pinglai Devi, Nerpinglai And Venkatesh Balaji</w:t>
-            </w:r>
-            <w:r>
-              <w:rPr>
-                <w:rtl w:val="0"/>
-              </w:rPr>
+              </w:rPr>
+              <w:t>मनुष्य गण / Manushya Gana</w:t>
             </w:r>
           </w:p>
         </w:tc>
@@ -2802,92 +2675,202 @@
         <w:tc>
           <w:tcPr>
             <w:tcBorders>
-              <w:top w:color="d9e0e8" w:space="0" w:sz="4" w:val="single"/>
-              <w:left w:color="b9c4d0" w:space="0" w:sz="4" w:val="single"/>
-              <w:bottom w:color="b9c4d0" w:space="0" w:sz="4" w:val="single"/>
-              <w:right w:color="d9e0e8" w:space="0" w:sz="4" w:val="single"/>
-            </w:tcBorders>
-            <w:shd w:fill="f2f5f9" w:val="clear"/>
-            <w:vAlign w:val="center"/>
-          </w:tcPr>
-          <w:p>
-            <w:pPr>
-              <w:widowControl w:val="0"/>
-              <w:rPr/>
-            </w:pPr>
-            <w:r>
-              <w:rPr>
-                <w:rFonts w:ascii="Noto Sans Devanagari" w:cs="Noto Sans Devanagari" w:eastAsia="Noto Sans Devanagari" w:hAnsi="Noto Sans Devanagari"/>
-                <w:b w:val="1"/>
-                <w:bCs w:val="1"/>
+              <w:top w:val="single" w:sz="4" w:space="0" w:color="b9c4d0"/>
+              <w:left w:val="single" w:sz="4" w:space="0" w:color="b9c4d0"/>
+              <w:bottom w:val="single" w:sz="4" w:space="0" w:color="d9e0e8"/>
+              <w:right w:val="single" w:sz="4" w:space="0" w:color="d9e0e8"/>
+            </w:tcBorders>
+            <w:shd w:val="clear" w:fill="f2f5f9"/>
+            <w:vAlign w:val="center"/>
+          </w:tcPr>
+          <w:p>
+            <w:pPr>
+              <w:spacing w:before="40" w:after="0" w:line="276" w:lineRule="auto"/>
+            </w:pPr>
+            <w:r/>
+            <w:r>
+              <w:rPr>
+                <w:rFonts w:ascii="Noto Sans Devanagari" w:hAnsi="Noto Sans Devanagari"/>
+                <w:b/>
                 <w:color w:val="222222"/>
                 <w:sz w:val="20"/>
-                <w:szCs w:val="20"/>
-                <w:rtl w:val="0"/>
-              </w:rPr>
-              <w:t xml:space="preserve">मंगळ स्थिती</w:t>
-            </w:r>
-            <w:r>
-              <w:rPr>
-                <w:rtl w:val="0"/>
-              </w:rPr>
-            </w:r>
-          </w:p>
-          <w:p>
-            <w:pPr>
-              <w:widowControl w:val="0"/>
-              <w:rPr/>
-            </w:pPr>
-            <w:r>
-              <w:rPr>
-                <w:rFonts w:ascii="Noto Sans Devanagari" w:cs="Noto Sans Devanagari" w:eastAsia="Noto Sans Devanagari" w:hAnsi="Noto Sans Devanagari"/>
-                <w:b w:val="1"/>
-                <w:bCs w:val="1"/>
-                <w:i w:val="1"/>
-                <w:iCs w:val="1"/>
-                <w:color w:val="51667f"/>
+              </w:rPr>
+              <w:t>गोत्र</w:t>
+            </w:r>
+          </w:p>
+          <w:p>
+            <w:pPr>
+              <w:spacing w:before="0" w:after="40" w:line="276" w:lineRule="auto"/>
+            </w:pPr>
+            <w:r>
+              <w:rPr>
+                <w:rFonts w:ascii="Noto Sans Devanagari" w:hAnsi="Noto Sans Devanagari"/>
+                <w:b/>
+                <w:color w:val="51667F"/>
                 <w:sz w:val="18"/>
-                <w:szCs w:val="18"/>
-                <w:rtl w:val="0"/>
-              </w:rPr>
-              <w:t xml:space="preserve">Manglik Status</w:t>
-            </w:r>
-            <w:r>
-              <w:rPr>
-                <w:rtl w:val="0"/>
-              </w:rPr>
-            </w:r>
-          </w:p>
-        </w:tc>
-        <w:tc>
-          <w:tcPr>
-            <w:tcBorders>
-              <w:top w:color="d9e0e8" w:space="0" w:sz="4" w:val="single"/>
-              <w:left w:color="d9e0e8" w:space="0" w:sz="4" w:val="single"/>
-              <w:bottom w:color="b9c4d0" w:space="0" w:sz="4" w:val="single"/>
-              <w:right w:color="b9c4d0" w:space="0" w:sz="4" w:val="single"/>
-            </w:tcBorders>
-            <w:vAlign w:val="center"/>
-          </w:tcPr>
-          <w:p>
-            <w:pPr>
-              <w:widowControl w:val="0"/>
-              <w:rPr/>
-            </w:pPr>
-            <w:r>
-              <w:rPr>
-                <w:rFonts w:ascii="Noto Sans Devanagari" w:cs="Noto Sans Devanagari" w:eastAsia="Noto Sans Devanagari" w:hAnsi="Noto Sans Devanagari"/>
+              </w:rPr>
+              <w:t>Gotra</w:t>
+            </w:r>
+          </w:p>
+        </w:tc>
+        <w:tc>
+          <w:tcPr>
+            <w:tcBorders>
+              <w:top w:val="single" w:sz="4" w:space="0" w:color="b9c4d0"/>
+              <w:left w:val="single" w:sz="4" w:space="0" w:color="d9e0e8"/>
+              <w:bottom w:val="single" w:sz="4" w:space="0" w:color="d9e0e8"/>
+              <w:right w:val="single" w:sz="4" w:space="0" w:color="b9c4d0"/>
+            </w:tcBorders>
+            <w:vAlign w:val="center"/>
+          </w:tcPr>
+          <w:p>
+            <w:pPr>
+              <w:spacing w:before="40" w:after="40" w:line="276" w:lineRule="auto"/>
+            </w:pPr>
+            <w:r/>
+            <w:r>
+              <w:rPr>
+                <w:rFonts w:ascii="Noto Sans Devanagari" w:hAnsi="Noto Sans Devanagari"/>
                 <w:color w:val="222222"/>
                 <w:sz w:val="21"/>
-                <w:szCs w:val="21"/>
-                <w:rtl w:val="0"/>
-              </w:rPr>
-              <w:t xml:space="preserve">नाही / No</w:t>
-            </w:r>
-            <w:r>
-              <w:rPr>
-                <w:rtl w:val="0"/>
-              </w:rPr>
+              </w:rPr>
+              <w:t>चांद्रात्र / Chandratr</w:t>
+            </w:r>
+          </w:p>
+        </w:tc>
+      </w:tr>
+      <w:tr>
+        <w:tc>
+          <w:tcPr>
+            <w:tcBorders>
+              <w:top w:val="single" w:sz="4" w:space="0" w:color="b9c4d0"/>
+              <w:left w:val="single" w:sz="4" w:space="0" w:color="b9c4d0"/>
+              <w:bottom w:val="single" w:sz="4" w:space="0" w:color="d9e0e8"/>
+              <w:right w:val="single" w:sz="4" w:space="0" w:color="d9e0e8"/>
+            </w:tcBorders>
+            <w:shd w:val="clear" w:fill="f2f5f9"/>
+            <w:vAlign w:val="center"/>
+          </w:tcPr>
+          <w:p>
+            <w:pPr>
+              <w:spacing w:before="40" w:after="0" w:line="276" w:lineRule="auto"/>
+            </w:pPr>
+            <w:r/>
+            <w:r>
+              <w:rPr>
+                <w:rFonts w:ascii="Noto Sans Devanagari" w:hAnsi="Noto Sans Devanagari"/>
+                <w:b/>
+                <w:color w:val="222222"/>
+                <w:sz w:val="20"/>
+              </w:rPr>
+              <w:t>कुलदेवता</w:t>
+            </w:r>
+          </w:p>
+          <w:p>
+            <w:pPr>
+              <w:spacing w:before="0" w:after="40" w:line="276" w:lineRule="auto"/>
+            </w:pPr>
+            <w:r>
+              <w:rPr>
+                <w:rFonts w:ascii="Noto Sans Devanagari" w:hAnsi="Noto Sans Devanagari"/>
+                <w:b/>
+                <w:color w:val="51667F"/>
+                <w:sz w:val="18"/>
+              </w:rPr>
+              <w:t>Kuladevata</w:t>
+            </w:r>
+          </w:p>
+        </w:tc>
+        <w:tc>
+          <w:tcPr>
+            <w:tcBorders>
+              <w:top w:val="single" w:sz="4" w:space="0" w:color="b9c4d0"/>
+              <w:left w:val="single" w:sz="4" w:space="0" w:color="d9e0e8"/>
+              <w:bottom w:val="single" w:sz="4" w:space="0" w:color="d9e0e8"/>
+              <w:right w:val="single" w:sz="4" w:space="0" w:color="b9c4d0"/>
+            </w:tcBorders>
+            <w:vAlign w:val="center"/>
+          </w:tcPr>
+          <w:p>
+            <w:pPr>
+              <w:spacing w:before="40" w:after="40" w:line="276" w:lineRule="auto"/>
+            </w:pPr>
+            <w:r/>
+            <w:r>
+              <w:rPr>
+                <w:rFonts w:ascii="Noto Sans Devanagari" w:hAnsi="Noto Sans Devanagari"/>
+                <w:color w:val="222222"/>
+                <w:sz w:val="21"/>
+              </w:rPr>
+              <w:t>पिंगलाई देवी, नेरपिंगलाई आणि व्यंकटेश बालाजी / Pinglai Devi, Nerpinglai And Venkatesh Balaji</w:t>
+            </w:r>
+          </w:p>
+        </w:tc>
+      </w:tr>
+      <w:tr>
+        <w:tc>
+          <w:tcPr>
+            <w:tcBorders>
+              <w:top w:val="single" w:sz="4" w:space="0" w:color="b9c4d0"/>
+              <w:left w:val="single" w:sz="4" w:space="0" w:color="b9c4d0"/>
+              <w:bottom w:val="single" w:sz="4" w:space="0" w:color="d9e0e8"/>
+              <w:right w:val="single" w:sz="4" w:space="0" w:color="d9e0e8"/>
+            </w:tcBorders>
+            <w:shd w:val="clear" w:fill="f2f5f9"/>
+            <w:vAlign w:val="center"/>
+          </w:tcPr>
+          <w:p>
+            <w:pPr>
+              <w:spacing w:before="40" w:after="0" w:line="276" w:lineRule="auto"/>
+            </w:pPr>
+            <w:r/>
+            <w:r>
+              <w:rPr>
+                <w:rFonts w:ascii="Noto Sans Devanagari" w:hAnsi="Noto Sans Devanagari"/>
+                <w:b/>
+                <w:color w:val="222222"/>
+                <w:sz w:val="20"/>
+              </w:rPr>
+              <w:t>मंगळ स्थिती</w:t>
+            </w:r>
+          </w:p>
+          <w:p>
+            <w:pPr>
+              <w:spacing w:before="0" w:after="40" w:line="276" w:lineRule="auto"/>
+            </w:pPr>
+            <w:r>
+              <w:rPr>
+                <w:rFonts w:ascii="Noto Sans Devanagari" w:hAnsi="Noto Sans Devanagari"/>
+                <w:b/>
+                <w:color w:val="51667F"/>
+                <w:sz w:val="18"/>
+              </w:rPr>
+              <w:t>Manglik Status</w:t>
+            </w:r>
+          </w:p>
+        </w:tc>
+        <w:tc>
+          <w:tcPr>
+            <w:tcBorders>
+              <w:top w:val="single" w:sz="4" w:space="0" w:color="b9c4d0"/>
+              <w:left w:val="single" w:sz="4" w:space="0" w:color="d9e0e8"/>
+              <w:bottom w:val="single" w:sz="4" w:space="0" w:color="d9e0e8"/>
+              <w:right w:val="single" w:sz="4" w:space="0" w:color="b9c4d0"/>
+            </w:tcBorders>
+            <w:vAlign w:val="center"/>
+          </w:tcPr>
+          <w:p>
+            <w:pPr>
+              <w:spacing w:before="40" w:after="40" w:line="276" w:lineRule="auto"/>
+            </w:pPr>
+            <w:r/>
+            <w:r>
+              <w:rPr>
+                <w:rFonts w:ascii="Noto Sans Devanagari" w:hAnsi="Noto Sans Devanagari"/>
+                <w:color w:val="222222"/>
+                <w:sz w:val="21"/>
+              </w:rPr>
+              <w:t>होय (मंगळ दोष आहे) / Yes (Manglik)</w:t>
             </w:r>
           </w:p>
         </w:tc>
@@ -2943,92 +2926,66 @@
         <w:tc>
           <w:tcPr>
             <w:tcBorders>
-              <w:top w:color="b9c4d0" w:space="0" w:sz="4" w:val="single"/>
-              <w:left w:color="b9c4d0" w:space="0" w:sz="4" w:val="single"/>
-              <w:bottom w:color="d9e0e8" w:space="0" w:sz="4" w:val="single"/>
-              <w:right w:color="d9e0e8" w:space="0" w:sz="4" w:val="single"/>
-            </w:tcBorders>
-            <w:shd w:fill="f2f5f9" w:val="clear"/>
-            <w:vAlign w:val="center"/>
-          </w:tcPr>
-          <w:p>
-            <w:pPr>
-              <w:widowControl w:val="0"/>
-              <w:rPr/>
-            </w:pPr>
-            <w:r>
-              <w:rPr>
-                <w:rFonts w:ascii="Noto Sans Devanagari" w:cs="Noto Sans Devanagari" w:eastAsia="Noto Sans Devanagari" w:hAnsi="Noto Sans Devanagari"/>
-                <w:b w:val="1"/>
-                <w:bCs w:val="1"/>
+              <w:top w:val="single" w:sz="4" w:space="0" w:color="b9c4d0"/>
+              <w:left w:val="single" w:sz="4" w:space="0" w:color="b9c4d0"/>
+              <w:bottom w:val="single" w:sz="4" w:space="0" w:color="d9e0e8"/>
+              <w:right w:val="single" w:sz="4" w:space="0" w:color="d9e0e8"/>
+            </w:tcBorders>
+            <w:shd w:val="clear" w:fill="f2f5f9"/>
+            <w:vAlign w:val="center"/>
+          </w:tcPr>
+          <w:p>
+            <w:pPr>
+              <w:spacing w:before="40" w:after="0" w:line="276" w:lineRule="auto"/>
+            </w:pPr>
+            <w:r/>
+            <w:r>
+              <w:rPr>
+                <w:rFonts w:ascii="Noto Sans Devanagari" w:hAnsi="Noto Sans Devanagari"/>
+                <w:b/>
                 <w:color w:val="222222"/>
                 <w:sz w:val="20"/>
-                <w:szCs w:val="20"/>
-                <w:rtl w:val="0"/>
-              </w:rPr>
-              <w:t xml:space="preserve">पत्ता</w:t>
-            </w:r>
-            <w:r>
-              <w:rPr>
-                <w:rtl w:val="0"/>
-              </w:rPr>
-            </w:r>
-          </w:p>
-          <w:p>
-            <w:pPr>
-              <w:widowControl w:val="0"/>
-              <w:rPr/>
-            </w:pPr>
-            <w:r>
-              <w:rPr>
-                <w:rFonts w:ascii="Noto Sans Devanagari" w:cs="Noto Sans Devanagari" w:eastAsia="Noto Sans Devanagari" w:hAnsi="Noto Sans Devanagari"/>
-                <w:b w:val="1"/>
-                <w:bCs w:val="1"/>
-                <w:i w:val="1"/>
-                <w:iCs w:val="1"/>
-                <w:color w:val="51667f"/>
+              </w:rPr>
+              <w:t>पत्ता</w:t>
+            </w:r>
+          </w:p>
+          <w:p>
+            <w:pPr>
+              <w:spacing w:before="0" w:after="40" w:line="276" w:lineRule="auto"/>
+            </w:pPr>
+            <w:r>
+              <w:rPr>
+                <w:rFonts w:ascii="Noto Sans Devanagari" w:hAnsi="Noto Sans Devanagari"/>
+                <w:b/>
+                <w:color w:val="51667F"/>
                 <w:sz w:val="18"/>
-                <w:szCs w:val="18"/>
-                <w:rtl w:val="0"/>
-              </w:rPr>
-              <w:t xml:space="preserve">Residential Address</w:t>
-            </w:r>
-            <w:r>
-              <w:rPr>
-                <w:rtl w:val="0"/>
-              </w:rPr>
-            </w:r>
-          </w:p>
-        </w:tc>
-        <w:tc>
-          <w:tcPr>
-            <w:tcBorders>
-              <w:top w:color="b9c4d0" w:space="0" w:sz="4" w:val="single"/>
-              <w:left w:color="d9e0e8" w:space="0" w:sz="4" w:val="single"/>
-              <w:bottom w:color="d9e0e8" w:space="0" w:sz="4" w:val="single"/>
-              <w:right w:color="b9c4d0" w:space="0" w:sz="4" w:val="single"/>
-            </w:tcBorders>
-            <w:vAlign w:val="center"/>
-          </w:tcPr>
-          <w:p>
-            <w:pPr>
-              <w:widowControl w:val="0"/>
-              <w:rPr/>
-            </w:pPr>
-            <w:r>
-              <w:rPr>
-                <w:rFonts w:ascii="Noto Sans Devanagari" w:cs="Noto Sans Devanagari" w:eastAsia="Noto Sans Devanagari" w:hAnsi="Noto Sans Devanagari"/>
+              </w:rPr>
+              <w:t>Residential Address</w:t>
+            </w:r>
+          </w:p>
+        </w:tc>
+        <w:tc>
+          <w:tcPr>
+            <w:tcBorders>
+              <w:top w:val="single" w:sz="4" w:space="0" w:color="b9c4d0"/>
+              <w:left w:val="single" w:sz="4" w:space="0" w:color="d9e0e8"/>
+              <w:bottom w:val="single" w:sz="4" w:space="0" w:color="d9e0e8"/>
+              <w:right w:val="single" w:sz="4" w:space="0" w:color="b9c4d0"/>
+            </w:tcBorders>
+            <w:vAlign w:val="center"/>
+          </w:tcPr>
+          <w:p>
+            <w:pPr>
+              <w:spacing w:before="40" w:after="40" w:line="276" w:lineRule="auto"/>
+            </w:pPr>
+            <w:r/>
+            <w:r>
+              <w:rPr>
+                <w:rFonts w:ascii="Noto Sans Devanagari" w:hAnsi="Noto Sans Devanagari"/>
                 <w:color w:val="222222"/>
                 <w:sz w:val="21"/>
-                <w:szCs w:val="21"/>
-                <w:rtl w:val="0"/>
-              </w:rPr>
-              <w:t xml:space="preserve">अभ्यंकर नगर, नागपूर, महाराष्ट्र / Abhyankar Nagar, Nagpur, Maharashtra</w:t>
-            </w:r>
-            <w:r>
-              <w:rPr>
-                <w:rtl w:val="0"/>
-              </w:rPr>
+              </w:rPr>
+              <w:t>अभ्यंकर नगर, नागपूर, महाराष्ट्र / Abhyankar Nagar, Nagpur, Maharashtra</w:t>
             </w:r>
           </w:p>
         </w:tc>
@@ -3041,92 +2998,79 @@
         <w:tc>
           <w:tcPr>
             <w:tcBorders>
-              <w:top w:color="d9e0e8" w:space="0" w:sz="4" w:val="single"/>
-              <w:left w:color="b9c4d0" w:space="0" w:sz="4" w:val="single"/>
-              <w:bottom w:color="d9e0e8" w:space="0" w:sz="4" w:val="single"/>
-              <w:right w:color="d9e0e8" w:space="0" w:sz="4" w:val="single"/>
-            </w:tcBorders>
-            <w:shd w:fill="f2f5f9" w:val="clear"/>
-            <w:vAlign w:val="center"/>
-          </w:tcPr>
-          <w:p>
-            <w:pPr>
-              <w:widowControl w:val="0"/>
-              <w:rPr/>
-            </w:pPr>
-            <w:r>
-              <w:rPr>
-                <w:rFonts w:ascii="Noto Sans Devanagari" w:cs="Noto Sans Devanagari" w:eastAsia="Noto Sans Devanagari" w:hAnsi="Noto Sans Devanagari"/>
-                <w:b w:val="1"/>
-                <w:bCs w:val="1"/>
+              <w:top w:val="single" w:sz="4" w:space="0" w:color="b9c4d0"/>
+              <w:left w:val="single" w:sz="4" w:space="0" w:color="b9c4d0"/>
+              <w:bottom w:val="single" w:sz="4" w:space="0" w:color="d9e0e8"/>
+              <w:right w:val="single" w:sz="4" w:space="0" w:color="d9e0e8"/>
+            </w:tcBorders>
+            <w:shd w:val="clear" w:fill="f2f5f9"/>
+            <w:vAlign w:val="center"/>
+          </w:tcPr>
+          <w:p>
+            <w:pPr>
+              <w:spacing w:before="40" w:after="0" w:line="276" w:lineRule="auto"/>
+            </w:pPr>
+            <w:r/>
+            <w:r>
+              <w:rPr>
+                <w:rFonts w:ascii="Noto Sans Devanagari" w:hAnsi="Noto Sans Devanagari"/>
+                <w:b/>
                 <w:color w:val="222222"/>
                 <w:sz w:val="20"/>
-                <w:szCs w:val="20"/>
-                <w:rtl w:val="0"/>
-              </w:rPr>
-              <w:t xml:space="preserve">संपर्क क्रमांक</w:t>
-            </w:r>
-            <w:r>
-              <w:rPr>
-                <w:rtl w:val="0"/>
-              </w:rPr>
-            </w:r>
-          </w:p>
-          <w:p>
-            <w:pPr>
-              <w:widowControl w:val="0"/>
-              <w:rPr/>
-            </w:pPr>
-            <w:r>
-              <w:rPr>
-                <w:rFonts w:ascii="Noto Sans Devanagari" w:cs="Noto Sans Devanagari" w:eastAsia="Noto Sans Devanagari" w:hAnsi="Noto Sans Devanagari"/>
-                <w:b w:val="1"/>
-                <w:bCs w:val="1"/>
-                <w:i w:val="1"/>
-                <w:iCs w:val="1"/>
-                <w:color w:val="51667f"/>
+              </w:rPr>
+              <w:t>संपत्ति घर</w:t>
+            </w:r>
+          </w:p>
+          <w:p>
+            <w:pPr>
+              <w:spacing w:before="0" w:after="40" w:line="276" w:lineRule="auto"/>
+            </w:pPr>
+            <w:r>
+              <w:rPr>
+                <w:rFonts w:ascii="Noto Sans Devanagari" w:hAnsi="Noto Sans Devanagari"/>
+                <w:b/>
+                <w:color w:val="51667F"/>
                 <w:sz w:val="18"/>
-                <w:szCs w:val="18"/>
-                <w:rtl w:val="0"/>
-              </w:rPr>
-              <w:t xml:space="preserve">Contact Number</w:t>
-            </w:r>
-            <w:r>
-              <w:rPr>
-                <w:rtl w:val="0"/>
-              </w:rPr>
-            </w:r>
-          </w:p>
-        </w:tc>
-        <w:tc>
-          <w:tcPr>
-            <w:tcBorders>
-              <w:top w:color="d9e0e8" w:space="0" w:sz="4" w:val="single"/>
-              <w:left w:color="d9e0e8" w:space="0" w:sz="4" w:val="single"/>
-              <w:bottom w:color="d9e0e8" w:space="0" w:sz="4" w:val="single"/>
-              <w:right w:color="b9c4d0" w:space="0" w:sz="4" w:val="single"/>
-            </w:tcBorders>
-            <w:vAlign w:val="center"/>
-          </w:tcPr>
-          <w:p>
-            <w:pPr>
-              <w:widowControl w:val="0"/>
-              <w:rPr/>
-            </w:pPr>
-            <w:r>
-              <w:rPr>
-                <w:rFonts w:ascii="Noto Sans Devanagari" w:cs="Noto Sans Devanagari" w:eastAsia="Noto Sans Devanagari" w:hAnsi="Noto Sans Devanagari"/>
+              </w:rPr>
+              <w:t>Property House</w:t>
+            </w:r>
+          </w:p>
+        </w:tc>
+        <w:tc>
+          <w:tcPr>
+            <w:tcBorders>
+              <w:top w:val="single" w:sz="4" w:space="0" w:color="b9c4d0"/>
+              <w:left w:val="single" w:sz="4" w:space="0" w:color="d9e0e8"/>
+              <w:bottom w:val="single" w:sz="4" w:space="0" w:color="d9e0e8"/>
+              <w:right w:val="single" w:sz="4" w:space="0" w:color="b9c4d0"/>
+            </w:tcBorders>
+            <w:vAlign w:val="center"/>
+          </w:tcPr>
+          <w:p>
+            <w:pPr>
+              <w:spacing w:before="40" w:after="40" w:line="276" w:lineRule="auto"/>
+            </w:pPr>
+            <w:r/>
+            <w:r>
+              <w:rPr>
+                <w:rFonts w:ascii="Noto Sans Devanagari" w:hAnsi="Noto Sans Devanagari"/>
                 <w:color w:val="222222"/>
                 <w:sz w:val="21"/>
-                <w:szCs w:val="21"/>
-                <w:rtl w:val="0"/>
-              </w:rPr>
-              <w:t xml:space="preserve">९८२२२३५०६७ , ९४०३५९०८९०, ८२०८००७६८८ / 9822235067 , 9403590890, 8208007688</w:t>
-            </w:r>
-            <w:r>
-              <w:rPr>
-                <w:rtl w:val="0"/>
-              </w:rPr>
+              </w:rPr>
+              <w:t>स्वतःचे घर (तळमजला + १ मजला) / Own house (Ground + 1 Floor)</w:t>
+            </w:r>
+          </w:p>
+          <w:p>
+            <w:pPr>
+              <w:spacing w:before="20" w:after="40" w:line="276" w:lineRule="auto"/>
+            </w:pPr>
+            <w:r>
+              <w:rPr>
+                <w:rFonts w:ascii="Noto Sans Devanagari" w:hAnsi="Noto Sans Devanagari"/>
+                <w:color w:val="51667F"/>
+                <w:sz w:val="18"/>
+              </w:rPr>
+              <w:t>तळमजला भाड्याने दिला आहे आणि आम्ही पहिल्या मजल्यावर राहतो. / Ground floor is on rent and live on 1st floor</w:t>
             </w:r>
           </w:p>
         </w:tc>
@@ -3139,92 +3083,160 @@
         <w:tc>
           <w:tcPr>
             <w:tcBorders>
-              <w:top w:color="d9e0e8" w:space="0" w:sz="4" w:val="single"/>
-              <w:left w:color="b9c4d0" w:space="0" w:sz="4" w:val="single"/>
-              <w:bottom w:color="b9c4d0" w:space="0" w:sz="4" w:val="single"/>
-              <w:right w:color="d9e0e8" w:space="0" w:sz="4" w:val="single"/>
-            </w:tcBorders>
-            <w:shd w:fill="f2f5f9" w:val="clear"/>
-            <w:vAlign w:val="center"/>
-          </w:tcPr>
-          <w:p>
-            <w:pPr>
-              <w:widowControl w:val="0"/>
-              <w:rPr/>
-            </w:pPr>
-            <w:r>
-              <w:rPr>
-                <w:rFonts w:ascii="Noto Sans Devanagari" w:cs="Noto Sans Devanagari" w:eastAsia="Noto Sans Devanagari" w:hAnsi="Noto Sans Devanagari"/>
-                <w:b w:val="1"/>
-                <w:bCs w:val="1"/>
+              <w:top w:val="single" w:sz="4" w:space="0" w:color="b9c4d0"/>
+              <w:left w:val="single" w:sz="4" w:space="0" w:color="b9c4d0"/>
+              <w:bottom w:val="single" w:sz="4" w:space="0" w:color="d9e0e8"/>
+              <w:right w:val="single" w:sz="4" w:space="0" w:color="d9e0e8"/>
+            </w:tcBorders>
+            <w:shd w:val="clear" w:fill="f2f5f9"/>
+            <w:vAlign w:val="center"/>
+          </w:tcPr>
+          <w:p>
+            <w:pPr>
+              <w:spacing w:before="40" w:after="0" w:line="276" w:lineRule="auto"/>
+            </w:pPr>
+            <w:r/>
+            <w:r>
+              <w:rPr>
+                <w:rFonts w:ascii="Noto Sans Devanagari" w:hAnsi="Noto Sans Devanagari"/>
+                <w:b/>
                 <w:color w:val="222222"/>
                 <w:sz w:val="20"/>
-                <w:szCs w:val="20"/>
-                <w:rtl w:val="0"/>
-              </w:rPr>
-              <w:t xml:space="preserve">ईमेल</w:t>
-            </w:r>
-            <w:r>
-              <w:rPr>
-                <w:rtl w:val="0"/>
-              </w:rPr>
-            </w:r>
-          </w:p>
-          <w:p>
-            <w:pPr>
-              <w:widowControl w:val="0"/>
-              <w:rPr/>
-            </w:pPr>
-            <w:r>
-              <w:rPr>
-                <w:rFonts w:ascii="Noto Sans Devanagari" w:cs="Noto Sans Devanagari" w:eastAsia="Noto Sans Devanagari" w:hAnsi="Noto Sans Devanagari"/>
-                <w:b w:val="1"/>
-                <w:bCs w:val="1"/>
-                <w:i w:val="1"/>
-                <w:iCs w:val="1"/>
-                <w:color w:val="51667f"/>
+              </w:rPr>
+              <w:t>संपर्क क्रमांक</w:t>
+            </w:r>
+          </w:p>
+          <w:p>
+            <w:pPr>
+              <w:spacing w:before="0" w:after="40" w:line="276" w:lineRule="auto"/>
+            </w:pPr>
+            <w:r>
+              <w:rPr>
+                <w:rFonts w:ascii="Noto Sans Devanagari" w:hAnsi="Noto Sans Devanagari"/>
+                <w:b/>
+                <w:color w:val="51667F"/>
                 <w:sz w:val="18"/>
-                <w:szCs w:val="18"/>
-                <w:rtl w:val="0"/>
-              </w:rPr>
-              <w:t xml:space="preserve">Email Address</w:t>
-            </w:r>
-            <w:r>
-              <w:rPr>
-                <w:rtl w:val="0"/>
-              </w:rPr>
-            </w:r>
-          </w:p>
-        </w:tc>
-        <w:tc>
-          <w:tcPr>
-            <w:tcBorders>
-              <w:top w:color="d9e0e8" w:space="0" w:sz="4" w:val="single"/>
-              <w:left w:color="d9e0e8" w:space="0" w:sz="4" w:val="single"/>
-              <w:bottom w:color="b9c4d0" w:space="0" w:sz="4" w:val="single"/>
-              <w:right w:color="b9c4d0" w:space="0" w:sz="4" w:val="single"/>
-            </w:tcBorders>
-            <w:vAlign w:val="center"/>
-          </w:tcPr>
-          <w:p>
-            <w:pPr>
-              <w:widowControl w:val="0"/>
-              <w:rPr/>
-            </w:pPr>
-            <w:r>
-              <w:rPr>
-                <w:rFonts w:ascii="Noto Sans Devanagari" w:cs="Noto Sans Devanagari" w:eastAsia="Noto Sans Devanagari" w:hAnsi="Noto Sans Devanagari"/>
+              </w:rPr>
+              <w:t>Contact Number</w:t>
+            </w:r>
+          </w:p>
+        </w:tc>
+        <w:tc>
+          <w:tcPr>
+            <w:tcBorders>
+              <w:top w:val="single" w:sz="4" w:space="0" w:color="b9c4d0"/>
+              <w:left w:val="single" w:sz="4" w:space="0" w:color="d9e0e8"/>
+              <w:bottom w:val="single" w:sz="4" w:space="0" w:color="d9e0e8"/>
+              <w:right w:val="single" w:sz="4" w:space="0" w:color="b9c4d0"/>
+            </w:tcBorders>
+            <w:vAlign w:val="center"/>
+          </w:tcPr>
+          <w:p>
+            <w:pPr>
+              <w:spacing w:before="40" w:after="40" w:line="276" w:lineRule="auto"/>
+            </w:pPr>
+            <w:r/>
+            <w:r>
+              <w:rPr>
+                <w:rFonts w:ascii="Noto Sans Devanagari" w:hAnsi="Noto Sans Devanagari"/>
                 <w:color w:val="222222"/>
                 <w:sz w:val="21"/>
-                <w:szCs w:val="21"/>
-                <w:rtl w:val="0"/>
-              </w:rPr>
-              <w:t xml:space="preserve">sumantjoshi24@gmail.com</w:t>
-            </w:r>
-            <w:r>
-              <w:rPr>
-                <w:rtl w:val="0"/>
-              </w:rPr>
+              </w:rPr>
+              <w:t>वडिलांचा क्र. / Father: ९८२२२३५०६९ (9822235069)</w:t>
+            </w:r>
+          </w:p>
+          <w:p>
+            <w:pPr>
+              <w:spacing w:before="20" w:after="40" w:line="276" w:lineRule="auto"/>
+            </w:pPr>
+            <w:r>
+              <w:rPr>
+                <w:rFonts w:ascii="Noto Sans Devanagari" w:hAnsi="Noto Sans Devanagari"/>
+                <w:color w:val="222222"/>
+                <w:sz w:val="21"/>
+              </w:rPr>
+              <w:t>आईचा क्र. / Mother: ९४०३५९०८९० (9403590890)</w:t>
+            </w:r>
+          </w:p>
+          <w:p>
+            <w:pPr>
+              <w:spacing w:before="20" w:after="40" w:line="276" w:lineRule="auto"/>
+            </w:pPr>
+            <w:r>
+              <w:rPr>
+                <w:rFonts w:ascii="Noto Sans Devanagari" w:hAnsi="Noto Sans Devanagari"/>
+                <w:color w:val="222222"/>
+                <w:sz w:val="21"/>
+              </w:rPr>
+              <w:t>मुलाचा क्र. / Son: ८२०८००७६८८ (8208007688)</w:t>
+            </w:r>
+          </w:p>
+        </w:tc>
+      </w:tr>
+      <w:tr>
+        <w:tc>
+          <w:tcPr>
+            <w:tcBorders>
+              <w:top w:val="single" w:sz="4" w:space="0" w:color="b9c4d0"/>
+              <w:left w:val="single" w:sz="4" w:space="0" w:color="b9c4d0"/>
+              <w:bottom w:val="single" w:sz="4" w:space="0" w:color="d9e0e8"/>
+              <w:right w:val="single" w:sz="4" w:space="0" w:color="d9e0e8"/>
+            </w:tcBorders>
+            <w:shd w:val="clear" w:fill="f2f5f9"/>
+            <w:vAlign w:val="center"/>
+          </w:tcPr>
+          <w:p>
+            <w:pPr>
+              <w:spacing w:before="40" w:after="0" w:line="276" w:lineRule="auto"/>
+            </w:pPr>
+            <w:r/>
+            <w:r>
+              <w:rPr>
+                <w:rFonts w:ascii="Noto Sans Devanagari" w:hAnsi="Noto Sans Devanagari"/>
+                <w:b/>
+                <w:color w:val="222222"/>
+                <w:sz w:val="20"/>
+              </w:rPr>
+              <w:t>ईमेल</w:t>
+            </w:r>
+          </w:p>
+          <w:p>
+            <w:pPr>
+              <w:spacing w:before="0" w:after="40" w:line="276" w:lineRule="auto"/>
+            </w:pPr>
+            <w:r>
+              <w:rPr>
+                <w:rFonts w:ascii="Noto Sans Devanagari" w:hAnsi="Noto Sans Devanagari"/>
+                <w:b/>
+                <w:color w:val="51667F"/>
+                <w:sz w:val="18"/>
+              </w:rPr>
+              <w:t>Email Address</w:t>
+            </w:r>
+          </w:p>
+        </w:tc>
+        <w:tc>
+          <w:tcPr>
+            <w:tcBorders>
+              <w:top w:val="single" w:sz="4" w:space="0" w:color="b9c4d0"/>
+              <w:left w:val="single" w:sz="4" w:space="0" w:color="d9e0e8"/>
+              <w:bottom w:val="single" w:sz="4" w:space="0" w:color="d9e0e8"/>
+              <w:right w:val="single" w:sz="4" w:space="0" w:color="b9c4d0"/>
+            </w:tcBorders>
+            <w:vAlign w:val="center"/>
+          </w:tcPr>
+          <w:p>
+            <w:pPr>
+              <w:spacing w:before="40" w:after="40" w:line="276" w:lineRule="auto"/>
+            </w:pPr>
+            <w:r/>
+            <w:r>
+              <w:rPr>
+                <w:rFonts w:ascii="Noto Sans Devanagari" w:hAnsi="Noto Sans Devanagari"/>
+                <w:color w:val="222222"/>
+                <w:sz w:val="21"/>
+              </w:rPr>
+              <w:t>sumantjoshi24@gmail.com</w:t>
             </w:r>
           </w:p>
         </w:tc>

</xml_diff>

<commit_message>
Update height to 6'1" (185.5 cm) across biodata, client, and Word document
</commit_message>
<xml_diff>
--- a/Marriage_Biodata_Marathi_English.docx
+++ b/Marriage_Biodata_Marathi_English.docx
@@ -689,23 +689,16 @@
           </w:tcPr>
           <w:p>
             <w:pPr>
-              <w:widowControl w:val="0"/>
-              <w:rPr/>
-            </w:pPr>
-            <w:r>
-              <w:rPr>
-                <w:rFonts w:ascii="Noto Sans Devanagari" w:cs="Noto Sans Devanagari" w:eastAsia="Noto Sans Devanagari" w:hAnsi="Noto Sans Devanagari"/>
+              <w:spacing w:before="40" w:after="40" w:line="276" w:lineRule="auto"/>
+            </w:pPr>
+            <w:r/>
+            <w:r>
+              <w:rPr>
+                <w:rFonts w:ascii="Noto Sans Devanagari" w:hAnsi="Noto Sans Devanagari"/>
                 <w:color w:val="222222"/>
                 <w:sz w:val="21"/>
-                <w:szCs w:val="21"/>
-                <w:rtl w:val="0"/>
-              </w:rPr>
-              <w:t xml:space="preserve">६ फूट ३ इंच / 6’3”</w:t>
-            </w:r>
-            <w:r>
-              <w:rPr>
-                <w:rtl w:val="0"/>
-              </w:rPr>
+              </w:rPr>
+              <w:t>६ फूट १ इंच / 6’1” (185.5 cm)</w:t>
             </w:r>
           </w:p>
         </w:tc>

</xml_diff>